<commit_message>
feat: populate all research variables directly into docx templates
</commit_message>
<xml_diff>
--- a/storage/app/templates/Template_Laporan.docx
+++ b/storage/app/templates/Template_Laporan.docx
@@ -683,74 +683,9 @@
         <w:ind w:left="285"/>
       </w:pPr>
       <w:r>
-        <w:t>Nama</w:t>
-      </w:r>
-      <w:r>
-        <w:rPr>
-          <w:spacing w:val="-2"/>
-        </w:rPr>
-        <w:t xml:space="preserve"> Lengkap</w:t>
-      </w:r>
-      <w:r>
+        <w:t>Nama Lengkap</w:t>
         <w:tab/>
-        <w:t>:</w:t>
-      </w:r>
-      <w:r>
-        <w:rPr>
-          <w:spacing w:val="-7"/>
-        </w:rPr>
-        <w:t xml:space="preserve"> </w:t>
-      </w:r>
-      <w:r>
-        <w:t>(Tulis</w:t>
-      </w:r>
-      <w:r>
-        <w:rPr>
-          <w:spacing w:val="-4"/>
-        </w:rPr>
-        <w:t xml:space="preserve"> </w:t>
-      </w:r>
-      <w:r>
-        <w:t>nama</w:t>
-      </w:r>
-      <w:r>
-        <w:rPr>
-          <w:spacing w:val="-3"/>
-        </w:rPr>
-        <w:t xml:space="preserve"> </w:t>
-      </w:r>
-      <w:r>
-        <w:t>ketua</w:t>
-      </w:r>
-      <w:r>
-        <w:rPr>
-          <w:spacing w:val="-3"/>
-        </w:rPr>
-        <w:t xml:space="preserve"> </w:t>
-      </w:r>
-      <w:r>
-        <w:t>Peneliti</w:t>
-      </w:r>
-      <w:r>
-        <w:rPr>
-          <w:spacing w:val="-3"/>
-        </w:rPr>
-        <w:t xml:space="preserve"> </w:t>
-      </w:r>
-      <w:r>
-        <w:t>beserta</w:t>
-      </w:r>
-      <w:r>
-        <w:rPr>
-          <w:spacing w:val="-4"/>
-        </w:rPr>
-        <w:t xml:space="preserve"> </w:t>
-      </w:r>
-      <w:r>
-        <w:rPr>
-          <w:spacing w:val="-2"/>
-        </w:rPr>
-        <w:t>gelar)</w:t>
+        <w:t>: ${NAMA_KETUA}</w:t>
       </w:r>
     </w:p>
     <w:p>
@@ -763,59 +698,9 @@
         <w:ind w:left="285"/>
       </w:pPr>
       <w:r>
-        <w:rPr>
-          <w:spacing w:val="-4"/>
-        </w:rPr>
         <w:t>NIDN</w:t>
-      </w:r>
-      <w:r>
         <w:tab/>
-        <w:t>:</w:t>
-      </w:r>
-      <w:r>
-        <w:rPr>
-          <w:spacing w:val="-8"/>
-        </w:rPr>
-        <w:t xml:space="preserve"> </w:t>
-      </w:r>
-      <w:r>
-        <w:t>(Tulis</w:t>
-      </w:r>
-      <w:r>
-        <w:rPr>
-          <w:spacing w:val="-5"/>
-        </w:rPr>
-        <w:t xml:space="preserve"> </w:t>
-      </w:r>
-      <w:r>
-        <w:t>NIDN</w:t>
-      </w:r>
-      <w:r>
-        <w:rPr>
-          <w:spacing w:val="-4"/>
-        </w:rPr>
-        <w:t xml:space="preserve"> </w:t>
-      </w:r>
-      <w:r>
-        <w:t>ketua</w:t>
-      </w:r>
-      <w:r>
-        <w:rPr>
-          <w:spacing w:val="-4"/>
-        </w:rPr>
-        <w:t xml:space="preserve"> </w:t>
-      </w:r>
-      <w:r>
-        <w:rPr>
-          <w:spacing w:val="-2"/>
-        </w:rPr>
-        <w:t>Peneliti</w:t>
-      </w:r>
-      <w:r>
-        <w:rPr>
-          <w:spacing w:val="-2"/>
-        </w:rPr>
-        <w:t>)</w:t>
+        <w:t>: ${NIDN_KETUA}</w:t>
       </w:r>
     </w:p>
     <w:p>
@@ -828,85 +713,9 @@
         <w:ind w:left="285"/>
       </w:pPr>
       <w:r>
-        <w:t>Jabatan</w:t>
-      </w:r>
-      <w:r>
-        <w:rPr>
-          <w:spacing w:val="-2"/>
-        </w:rPr>
-        <w:t xml:space="preserve"> Fungsional</w:t>
-      </w:r>
-      <w:r>
+        <w:t>Jabatan Fungsional</w:t>
         <w:tab/>
-      </w:r>
-      <w:r>
-        <w:rPr>
-          <w:spacing w:val="-2"/>
-        </w:rPr>
-        <w:t>:</w:t>
-      </w:r>
-      <w:r>
-        <w:rPr>
-          <w:spacing w:val="-5"/>
-        </w:rPr>
-        <w:t xml:space="preserve"> </w:t>
-      </w:r>
-      <w:r>
-        <w:rPr>
-          <w:spacing w:val="-2"/>
-        </w:rPr>
-        <w:t>(Tulis</w:t>
-      </w:r>
-      <w:r>
-        <w:rPr>
-          <w:spacing w:val="-6"/>
-        </w:rPr>
-        <w:t xml:space="preserve"> </w:t>
-      </w:r>
-      <w:r>
-        <w:rPr>
-          <w:spacing w:val="-2"/>
-        </w:rPr>
-        <w:t>Jabatan</w:t>
-      </w:r>
-      <w:r>
-        <w:rPr>
-          <w:spacing w:val="-9"/>
-        </w:rPr>
-        <w:t xml:space="preserve"> </w:t>
-      </w:r>
-      <w:r>
-        <w:rPr>
-          <w:spacing w:val="-2"/>
-        </w:rPr>
-        <w:t>Fungsional</w:t>
-      </w:r>
-      <w:r>
-        <w:rPr>
-          <w:spacing w:val="-6"/>
-        </w:rPr>
-        <w:t xml:space="preserve"> </w:t>
-      </w:r>
-      <w:r>
-        <w:rPr>
-          <w:spacing w:val="-2"/>
-        </w:rPr>
-        <w:t>ketua</w:t>
-      </w:r>
-      <w:r>
-        <w:t xml:space="preserve"> </w:t>
-      </w:r>
-      <w:r>
-        <w:rPr>
-          <w:spacing w:val="-2"/>
-        </w:rPr>
-        <w:t>Peneliti</w:t>
-      </w:r>
-      <w:r>
-        <w:rPr>
-          <w:spacing w:val="-2"/>
-        </w:rPr>
-        <w:t>)</w:t>
+        <w:t>: ${JABATAN_KETUA}</w:t>
       </w:r>
     </w:p>
     <w:p>
@@ -919,77 +728,9 @@
         <w:ind w:left="285"/>
       </w:pPr>
       <w:r>
-        <w:t>Program</w:t>
-      </w:r>
-      <w:r>
-        <w:rPr>
-          <w:spacing w:val="-3"/>
-        </w:rPr>
-        <w:t xml:space="preserve"> </w:t>
-      </w:r>
-      <w:r>
-        <w:rPr>
-          <w:spacing w:val="-2"/>
-        </w:rPr>
-        <w:t>Studi</w:t>
-      </w:r>
-      <w:r>
+        <w:t>Program Studi</w:t>
         <w:tab/>
-        <w:t>:</w:t>
-      </w:r>
-      <w:r>
-        <w:rPr>
-          <w:spacing w:val="-7"/>
-        </w:rPr>
-        <w:t xml:space="preserve"> </w:t>
-      </w:r>
-      <w:r>
-        <w:t>(Tulis</w:t>
-      </w:r>
-      <w:r>
-        <w:rPr>
-          <w:spacing w:val="-7"/>
-        </w:rPr>
-        <w:t xml:space="preserve"> </w:t>
-      </w:r>
-      <w:r>
-        <w:t>Program</w:t>
-      </w:r>
-      <w:r>
-        <w:rPr>
-          <w:spacing w:val="-3"/>
-        </w:rPr>
-        <w:t xml:space="preserve"> </w:t>
-      </w:r>
-      <w:r>
-        <w:t>Studi</w:t>
-      </w:r>
-      <w:r>
-        <w:rPr>
-          <w:spacing w:val="-2"/>
-        </w:rPr>
-        <w:t xml:space="preserve"> </w:t>
-      </w:r>
-      <w:r>
-        <w:t>ketua</w:t>
-      </w:r>
-      <w:r>
-        <w:rPr>
-          <w:spacing w:val="-2"/>
-        </w:rPr>
-        <w:t xml:space="preserve"> </w:t>
-      </w:r>
-      <w:r>
-        <w:rPr>
-          <w:spacing w:val="-2"/>
-        </w:rPr>
-        <w:t>Peneliti</w:t>
-      </w:r>
-      <w:r>
-        <w:rPr>
-          <w:spacing w:val="-2"/>
-        </w:rPr>
-        <w:t>)</w:t>
+        <w:t>: ${PRODI_KETUA}</w:t>
       </w:r>
     </w:p>
     <w:p>
@@ -1002,68 +743,9 @@
         <w:ind w:left="285"/>
       </w:pPr>
       <w:r>
-        <w:t>Nomor</w:t>
-      </w:r>
-      <w:r>
-        <w:rPr>
-          <w:spacing w:val="-1"/>
-        </w:rPr>
-        <w:t xml:space="preserve"> </w:t>
-      </w:r>
-      <w:r>
-        <w:rPr>
-          <w:spacing w:val="-5"/>
-        </w:rPr>
-        <w:t>HP</w:t>
-      </w:r>
-      <w:r>
+        <w:t>Nomor HP</w:t>
         <w:tab/>
-        <w:t>:</w:t>
-      </w:r>
-      <w:r>
-        <w:rPr>
-          <w:spacing w:val="-7"/>
-        </w:rPr>
-        <w:t xml:space="preserve"> </w:t>
-      </w:r>
-      <w:r>
-        <w:t>(Tulis</w:t>
-      </w:r>
-      <w:r>
-        <w:rPr>
-          <w:spacing w:val="-5"/>
-        </w:rPr>
-        <w:t xml:space="preserve"> </w:t>
-      </w:r>
-      <w:r>
-        <w:t>HP</w:t>
-      </w:r>
-      <w:r>
-        <w:rPr>
-          <w:spacing w:val="-13"/>
-        </w:rPr>
-        <w:t xml:space="preserve"> </w:t>
-      </w:r>
-      <w:r>
-        <w:t>ketua</w:t>
-      </w:r>
-      <w:r>
-        <w:rPr>
-          <w:spacing w:val="-3"/>
-        </w:rPr>
-        <w:t xml:space="preserve"> </w:t>
-      </w:r>
-      <w:r>
-        <w:rPr>
-          <w:spacing w:val="-2"/>
-        </w:rPr>
-        <w:t>Peneliti</w:t>
-      </w:r>
-      <w:r>
-        <w:rPr>
-          <w:spacing w:val="-2"/>
-        </w:rPr>
-        <w:t>)</w:t>
+        <w:t>: ${HP_KETUA}</w:t>
       </w:r>
     </w:p>
     <w:p>
@@ -1076,80 +758,9 @@
         <w:ind w:left="285"/>
       </w:pPr>
       <w:r>
-        <w:t>Alamat</w:t>
-      </w:r>
-      <w:r>
-        <w:rPr>
-          <w:spacing w:val="-2"/>
-        </w:rPr>
-        <w:t xml:space="preserve"> </w:t>
-      </w:r>
-      <w:r>
-        <w:t>surel</w:t>
-      </w:r>
-      <w:r>
-        <w:rPr>
-          <w:spacing w:val="-2"/>
-        </w:rPr>
-        <w:t xml:space="preserve"> </w:t>
-      </w:r>
-      <w:r>
-        <w:t>(e-</w:t>
-      </w:r>
-      <w:r>
-        <w:rPr>
-          <w:spacing w:val="-2"/>
-        </w:rPr>
-        <w:t>mail)</w:t>
-      </w:r>
-      <w:r>
+        <w:t>Alamat surel (e-mail)</w:t>
         <w:tab/>
-        <w:t>:</w:t>
-      </w:r>
-      <w:r>
-        <w:rPr>
-          <w:spacing w:val="-7"/>
-        </w:rPr>
-        <w:t xml:space="preserve"> </w:t>
-      </w:r>
-      <w:r>
-        <w:t>(Tulis</w:t>
-      </w:r>
-      <w:r>
-        <w:rPr>
-          <w:spacing w:val="-5"/>
-        </w:rPr>
-        <w:t xml:space="preserve"> </w:t>
-      </w:r>
-      <w:r>
-        <w:t>surel</w:t>
-      </w:r>
-      <w:r>
-        <w:rPr>
-          <w:spacing w:val="-3"/>
-        </w:rPr>
-        <w:t xml:space="preserve"> </w:t>
-      </w:r>
-      <w:r>
-        <w:t>ketua</w:t>
-      </w:r>
-      <w:r>
-        <w:rPr>
-          <w:spacing w:val="-4"/>
-        </w:rPr>
-        <w:t xml:space="preserve"> </w:t>
-      </w:r>
-      <w:r>
-        <w:rPr>
-          <w:spacing w:val="-2"/>
-        </w:rPr>
-        <w:t>Peneliti</w:t>
-      </w:r>
-      <w:r>
-        <w:rPr>
-          <w:spacing w:val="-2"/>
-        </w:rPr>
-        <w:t>)</w:t>
+        <w:t>: ${EMAIL_KETUA}</w:t>
       </w:r>
     </w:p>
     <w:p>
@@ -1192,62 +803,9 @@
         <w:ind w:left="285"/>
       </w:pPr>
       <w:r>
-        <w:t>Nama</w:t>
-      </w:r>
-      <w:r>
-        <w:rPr>
-          <w:spacing w:val="-2"/>
-        </w:rPr>
-        <w:t xml:space="preserve"> Lengkap</w:t>
-      </w:r>
-      <w:r>
+        <w:t>Nama Lengkap</w:t>
         <w:tab/>
-        <w:t>:</w:t>
-      </w:r>
-      <w:r>
-        <w:rPr>
-          <w:spacing w:val="-7"/>
-        </w:rPr>
-        <w:t xml:space="preserve"> </w:t>
-      </w:r>
-      <w:r>
-        <w:t>(Tulis</w:t>
-      </w:r>
-      <w:r>
-        <w:rPr>
-          <w:spacing w:val="-5"/>
-        </w:rPr>
-        <w:t xml:space="preserve"> </w:t>
-      </w:r>
-      <w:r>
-        <w:t>nama</w:t>
-      </w:r>
-      <w:r>
-        <w:rPr>
-          <w:spacing w:val="-3"/>
-        </w:rPr>
-        <w:t xml:space="preserve"> </w:t>
-      </w:r>
-      <w:r>
-        <w:t>anggota</w:t>
-      </w:r>
-      <w:r>
-        <w:rPr>
-          <w:spacing w:val="-4"/>
-        </w:rPr>
-        <w:t xml:space="preserve"> </w:t>
-      </w:r>
-      <w:r>
-        <w:rPr>
-          <w:spacing w:val="-2"/>
-        </w:rPr>
-        <w:t>Peneliti</w:t>
-      </w:r>
-      <w:r>
-        <w:rPr>
-          <w:spacing w:val="-2"/>
-        </w:rPr>
-        <w:t>)</w:t>
+        <w:t>: ${NAMA_ANGGOTA}</w:t>
       </w:r>
     </w:p>
     <w:p>
@@ -1260,59 +818,9 @@
         <w:ind w:left="285"/>
       </w:pPr>
       <w:r>
-        <w:rPr>
-          <w:spacing w:val="-4"/>
-        </w:rPr>
         <w:t>NIDN</w:t>
-      </w:r>
-      <w:r>
         <w:tab/>
-        <w:t>:</w:t>
-      </w:r>
-      <w:r>
-        <w:rPr>
-          <w:spacing w:val="-8"/>
-        </w:rPr>
-        <w:t xml:space="preserve"> </w:t>
-      </w:r>
-      <w:r>
-        <w:t>(Tulis</w:t>
-      </w:r>
-      <w:r>
-        <w:rPr>
-          <w:spacing w:val="-5"/>
-        </w:rPr>
-        <w:t xml:space="preserve"> </w:t>
-      </w:r>
-      <w:r>
-        <w:t>NIDN</w:t>
-      </w:r>
-      <w:r>
-        <w:rPr>
-          <w:spacing w:val="-5"/>
-        </w:rPr>
-        <w:t xml:space="preserve"> </w:t>
-      </w:r>
-      <w:r>
-        <w:t>anggota</w:t>
-      </w:r>
-      <w:r>
-        <w:rPr>
-          <w:spacing w:val="-4"/>
-        </w:rPr>
-        <w:t xml:space="preserve"> </w:t>
-      </w:r>
-      <w:r>
-        <w:rPr>
-          <w:spacing w:val="-2"/>
-        </w:rPr>
-        <w:t>Peneliti</w:t>
-      </w:r>
-      <w:r>
-        <w:rPr>
-          <w:spacing w:val="-2"/>
-        </w:rPr>
-        <w:t>)</w:t>
+        <w:t>: ${NIDN_ANGGOTA}</w:t>
       </w:r>
     </w:p>
     <w:p>
@@ -1325,85 +833,9 @@
         <w:ind w:left="285"/>
       </w:pPr>
       <w:r>
-        <w:t>Jabatan</w:t>
-      </w:r>
-      <w:r>
-        <w:rPr>
-          <w:spacing w:val="-2"/>
-        </w:rPr>
-        <w:t xml:space="preserve"> Fungsional</w:t>
-      </w:r>
-      <w:r>
+        <w:t>Jabatan Fungsional</w:t>
         <w:tab/>
-      </w:r>
-      <w:r>
-        <w:rPr>
-          <w:spacing w:val="-2"/>
-        </w:rPr>
-        <w:t>:</w:t>
-      </w:r>
-      <w:r>
-        <w:rPr>
-          <w:spacing w:val="-4"/>
-        </w:rPr>
-        <w:t xml:space="preserve"> </w:t>
-      </w:r>
-      <w:r>
-        <w:rPr>
-          <w:spacing w:val="-2"/>
-        </w:rPr>
-        <w:t>(Tulis</w:t>
-      </w:r>
-      <w:r>
-        <w:rPr>
-          <w:spacing w:val="-5"/>
-        </w:rPr>
-        <w:t xml:space="preserve"> </w:t>
-      </w:r>
-      <w:r>
-        <w:rPr>
-          <w:spacing w:val="-2"/>
-        </w:rPr>
-        <w:t>Jabatan</w:t>
-      </w:r>
-      <w:r>
-        <w:rPr>
-          <w:spacing w:val="-8"/>
-        </w:rPr>
-        <w:t xml:space="preserve"> </w:t>
-      </w:r>
-      <w:r>
-        <w:rPr>
-          <w:spacing w:val="-2"/>
-        </w:rPr>
-        <w:t>Fungsional</w:t>
-      </w:r>
-      <w:r>
-        <w:rPr>
-          <w:spacing w:val="-5"/>
-        </w:rPr>
-        <w:t xml:space="preserve"> </w:t>
-      </w:r>
-      <w:r>
-        <w:rPr>
-          <w:spacing w:val="-2"/>
-        </w:rPr>
-        <w:t>anggota</w:t>
-      </w:r>
-      <w:r>
-        <w:t xml:space="preserve"> </w:t>
-      </w:r>
-      <w:r>
-        <w:rPr>
-          <w:spacing w:val="-2"/>
-        </w:rPr>
-        <w:t>Peneliti</w:t>
-      </w:r>
-      <w:r>
-        <w:rPr>
-          <w:spacing w:val="-2"/>
-        </w:rPr>
-        <w:t>)</w:t>
+        <w:t>: ${JABATAN_ANGGOTA}</w:t>
       </w:r>
     </w:p>
     <w:p>
@@ -1416,77 +848,9 @@
         <w:ind w:left="285"/>
       </w:pPr>
       <w:r>
-        <w:t>Program</w:t>
-      </w:r>
-      <w:r>
-        <w:rPr>
-          <w:spacing w:val="-3"/>
-        </w:rPr>
-        <w:t xml:space="preserve"> </w:t>
-      </w:r>
-      <w:r>
-        <w:rPr>
-          <w:spacing w:val="-2"/>
-        </w:rPr>
-        <w:t>Studi</w:t>
-      </w:r>
-      <w:r>
+        <w:t>Program Studi</w:t>
         <w:tab/>
-        <w:t>:</w:t>
-      </w:r>
-      <w:r>
-        <w:rPr>
-          <w:spacing w:val="-7"/>
-        </w:rPr>
-        <w:t xml:space="preserve"> </w:t>
-      </w:r>
-      <w:r>
-        <w:t>(Tulis</w:t>
-      </w:r>
-      <w:r>
-        <w:rPr>
-          <w:spacing w:val="-7"/>
-        </w:rPr>
-        <w:t xml:space="preserve"> </w:t>
-      </w:r>
-      <w:r>
-        <w:t>Program</w:t>
-      </w:r>
-      <w:r>
-        <w:rPr>
-          <w:spacing w:val="-3"/>
-        </w:rPr>
-        <w:t xml:space="preserve"> </w:t>
-      </w:r>
-      <w:r>
-        <w:t>Studi</w:t>
-      </w:r>
-      <w:r>
-        <w:rPr>
-          <w:spacing w:val="-2"/>
-        </w:rPr>
-        <w:t xml:space="preserve"> </w:t>
-      </w:r>
-      <w:r>
-        <w:t>anggota</w:t>
-      </w:r>
-      <w:r>
-        <w:rPr>
-          <w:spacing w:val="-2"/>
-        </w:rPr>
-        <w:t xml:space="preserve"> </w:t>
-      </w:r>
-      <w:r>
-        <w:rPr>
-          <w:spacing w:val="-2"/>
-        </w:rPr>
-        <w:t>Peneliti</w:t>
-      </w:r>
-      <w:r>
-        <w:rPr>
-          <w:spacing w:val="-2"/>
-        </w:rPr>
-        <w:t>)</w:t>
+        <w:t>: ${PRODI_ANGGOTA}</w:t>
       </w:r>
     </w:p>
     <w:p>
@@ -1529,62 +893,9 @@
         <w:ind w:left="285"/>
       </w:pPr>
       <w:r>
-        <w:t>Nama</w:t>
-      </w:r>
-      <w:r>
-        <w:rPr>
-          <w:spacing w:val="-2"/>
-        </w:rPr>
-        <w:t xml:space="preserve"> Lengkap</w:t>
-      </w:r>
-      <w:r>
+        <w:t>Nama Lengkap</w:t>
         <w:tab/>
-        <w:t>:</w:t>
-      </w:r>
-      <w:r>
-        <w:rPr>
-          <w:spacing w:val="-7"/>
-        </w:rPr>
-        <w:t xml:space="preserve"> </w:t>
-      </w:r>
-      <w:r>
-        <w:t>(Tulis</w:t>
-      </w:r>
-      <w:r>
-        <w:rPr>
-          <w:spacing w:val="-5"/>
-        </w:rPr>
-        <w:t xml:space="preserve"> </w:t>
-      </w:r>
-      <w:r>
-        <w:t>nama</w:t>
-      </w:r>
-      <w:r>
-        <w:rPr>
-          <w:spacing w:val="-3"/>
-        </w:rPr>
-        <w:t xml:space="preserve"> </w:t>
-      </w:r>
-      <w:r>
-        <w:t>anggota</w:t>
-      </w:r>
-      <w:r>
-        <w:rPr>
-          <w:spacing w:val="-4"/>
-        </w:rPr>
-        <w:t xml:space="preserve"> </w:t>
-      </w:r>
-      <w:r>
-        <w:rPr>
-          <w:spacing w:val="-2"/>
-        </w:rPr>
-        <w:t>Peneliti</w:t>
-      </w:r>
-      <w:r>
-        <w:rPr>
-          <w:spacing w:val="-2"/>
-        </w:rPr>
-        <w:t>)</w:t>
+        <w:t>: ${NAMA_ANGGOTA}</w:t>
       </w:r>
     </w:p>
     <w:p>
@@ -1597,62 +908,9 @@
         <w:ind w:left="285"/>
       </w:pPr>
       <w:r>
-        <w:rPr>
-          <w:spacing w:val="-4"/>
-        </w:rPr>
         <w:t>NIDN</w:t>
-      </w:r>
-      <w:r>
         <w:tab/>
-        <w:t>:</w:t>
-      </w:r>
-      <w:r>
-        <w:rPr>
-          <w:spacing w:val="-7"/>
-        </w:rPr>
-        <w:t xml:space="preserve"> </w:t>
-      </w:r>
-      <w:r>
-        <w:t>(Tulis</w:t>
-      </w:r>
-      <w:r>
-        <w:rPr>
-          <w:spacing w:val="-5"/>
-        </w:rPr>
-        <w:t xml:space="preserve"> </w:t>
-      </w:r>
-      <w:r>
-        <w:t>a</w:t>
-      </w:r>
-      <w:r>
-        <w:t>nggota</w:t>
-      </w:r>
-      <w:r>
-        <w:rPr>
-          <w:spacing w:val="-4"/>
-        </w:rPr>
-        <w:t xml:space="preserve"> </w:t>
-      </w:r>
-      <w:r>
-        <w:t>anggota</w:t>
-      </w:r>
-      <w:r>
-        <w:rPr>
-          <w:spacing w:val="-5"/>
-        </w:rPr>
-        <w:t xml:space="preserve"> </w:t>
-      </w:r>
-      <w:r>
-        <w:rPr>
-          <w:spacing w:val="-2"/>
-        </w:rPr>
-        <w:t>Peneliti</w:t>
-      </w:r>
-      <w:r>
-        <w:rPr>
-          <w:spacing w:val="-2"/>
-        </w:rPr>
-        <w:t>)</w:t>
+        <w:t>: ${NIDN_ANGGOTA}</w:t>
       </w:r>
     </w:p>
     <w:p>
@@ -1665,85 +923,9 @@
         <w:ind w:left="285"/>
       </w:pPr>
       <w:r>
-        <w:t>Jabatan</w:t>
-      </w:r>
-      <w:r>
-        <w:rPr>
-          <w:spacing w:val="-2"/>
-        </w:rPr>
-        <w:t xml:space="preserve"> Fungsional</w:t>
-      </w:r>
-      <w:r>
+        <w:t>Jabatan Fungsional</w:t>
         <w:tab/>
-      </w:r>
-      <w:r>
-        <w:rPr>
-          <w:spacing w:val="-2"/>
-        </w:rPr>
-        <w:t>:</w:t>
-      </w:r>
-      <w:r>
-        <w:rPr>
-          <w:spacing w:val="-4"/>
-        </w:rPr>
-        <w:t xml:space="preserve"> </w:t>
-      </w:r>
-      <w:r>
-        <w:rPr>
-          <w:spacing w:val="-2"/>
-        </w:rPr>
-        <w:t>(Tulis</w:t>
-      </w:r>
-      <w:r>
-        <w:rPr>
-          <w:spacing w:val="-5"/>
-        </w:rPr>
-        <w:t xml:space="preserve"> </w:t>
-      </w:r>
-      <w:r>
-        <w:rPr>
-          <w:spacing w:val="-2"/>
-        </w:rPr>
-        <w:t>Jabatan</w:t>
-      </w:r>
-      <w:r>
-        <w:rPr>
-          <w:spacing w:val="-8"/>
-        </w:rPr>
-        <w:t xml:space="preserve"> </w:t>
-      </w:r>
-      <w:r>
-        <w:rPr>
-          <w:spacing w:val="-2"/>
-        </w:rPr>
-        <w:t>Fungsional</w:t>
-      </w:r>
-      <w:r>
-        <w:rPr>
-          <w:spacing w:val="-5"/>
-        </w:rPr>
-        <w:t xml:space="preserve"> </w:t>
-      </w:r>
-      <w:r>
-        <w:rPr>
-          <w:spacing w:val="-2"/>
-        </w:rPr>
-        <w:t>anggota</w:t>
-      </w:r>
-      <w:r>
-        <w:t xml:space="preserve"> </w:t>
-      </w:r>
-      <w:r>
-        <w:rPr>
-          <w:spacing w:val="-2"/>
-        </w:rPr>
-        <w:t>Peneliti</w:t>
-      </w:r>
-      <w:r>
-        <w:rPr>
-          <w:spacing w:val="-2"/>
-        </w:rPr>
-        <w:t>)</w:t>
+        <w:t>: ${JABATAN_ANGGOTA}</w:t>
       </w:r>
     </w:p>
     <w:p>
@@ -1756,77 +938,9 @@
         <w:ind w:left="285"/>
       </w:pPr>
       <w:r>
-        <w:t>Program</w:t>
-      </w:r>
-      <w:r>
-        <w:rPr>
-          <w:spacing w:val="-3"/>
-        </w:rPr>
-        <w:t xml:space="preserve"> </w:t>
-      </w:r>
-      <w:r>
-        <w:rPr>
-          <w:spacing w:val="-2"/>
-        </w:rPr>
-        <w:t>Studi</w:t>
-      </w:r>
-      <w:r>
+        <w:t>Program Studi</w:t>
         <w:tab/>
-        <w:t>:</w:t>
-      </w:r>
-      <w:r>
-        <w:rPr>
-          <w:spacing w:val="-7"/>
-        </w:rPr>
-        <w:t xml:space="preserve"> </w:t>
-      </w:r>
-      <w:r>
-        <w:t>(Tulis</w:t>
-      </w:r>
-      <w:r>
-        <w:rPr>
-          <w:spacing w:val="-7"/>
-        </w:rPr>
-        <w:t xml:space="preserve"> </w:t>
-      </w:r>
-      <w:r>
-        <w:t>Program</w:t>
-      </w:r>
-      <w:r>
-        <w:rPr>
-          <w:spacing w:val="-3"/>
-        </w:rPr>
-        <w:t xml:space="preserve"> </w:t>
-      </w:r>
-      <w:r>
-        <w:t>Studi</w:t>
-      </w:r>
-      <w:r>
-        <w:rPr>
-          <w:spacing w:val="-2"/>
-        </w:rPr>
-        <w:t xml:space="preserve"> </w:t>
-      </w:r>
-      <w:r>
-        <w:t>anggota</w:t>
-      </w:r>
-      <w:r>
-        <w:rPr>
-          <w:spacing w:val="-2"/>
-        </w:rPr>
-        <w:t xml:space="preserve"> </w:t>
-      </w:r>
-      <w:r>
-        <w:rPr>
-          <w:spacing w:val="-2"/>
-        </w:rPr>
-        <w:t>Peneliti</w:t>
-      </w:r>
-      <w:r>
-        <w:rPr>
-          <w:spacing w:val="-2"/>
-        </w:rPr>
-        <w:t>)</w:t>
+        <w:t>: ${PRODI_ANGGOTA}</w:t>
       </w:r>
     </w:p>
     <w:p>
@@ -1869,62 +983,9 @@
         <w:ind w:left="285"/>
       </w:pPr>
       <w:r>
-        <w:t>Nama</w:t>
-      </w:r>
-      <w:r>
-        <w:rPr>
-          <w:spacing w:val="-2"/>
-        </w:rPr>
-        <w:t xml:space="preserve"> Lengkap</w:t>
-      </w:r>
-      <w:r>
+        <w:t>Nama Lengkap</w:t>
         <w:tab/>
-        <w:t>:</w:t>
-      </w:r>
-      <w:r>
-        <w:rPr>
-          <w:spacing w:val="-7"/>
-        </w:rPr>
-        <w:t xml:space="preserve"> </w:t>
-      </w:r>
-      <w:r>
-        <w:t>(Tulis</w:t>
-      </w:r>
-      <w:r>
-        <w:rPr>
-          <w:spacing w:val="-5"/>
-        </w:rPr>
-        <w:t xml:space="preserve"> </w:t>
-      </w:r>
-      <w:r>
-        <w:t>nama</w:t>
-      </w:r>
-      <w:r>
-        <w:rPr>
-          <w:spacing w:val="-3"/>
-        </w:rPr>
-        <w:t xml:space="preserve"> </w:t>
-      </w:r>
-      <w:r>
-        <w:t>anggota</w:t>
-      </w:r>
-      <w:r>
-        <w:rPr>
-          <w:spacing w:val="-4"/>
-        </w:rPr>
-        <w:t xml:space="preserve"> </w:t>
-      </w:r>
-      <w:r>
-        <w:rPr>
-          <w:spacing w:val="-2"/>
-        </w:rPr>
-        <w:t>Peneliti</w:t>
-      </w:r>
-      <w:r>
-        <w:rPr>
-          <w:spacing w:val="-2"/>
-        </w:rPr>
-        <w:t>)</w:t>
+        <w:t>: ${NAMA_ANGGOTA}</w:t>
       </w:r>
     </w:p>
     <w:p>
@@ -1937,59 +998,9 @@
         <w:ind w:left="285"/>
       </w:pPr>
       <w:r>
-        <w:rPr>
-          <w:spacing w:val="-4"/>
-        </w:rPr>
         <w:t>NIDN</w:t>
-      </w:r>
-      <w:r>
         <w:tab/>
-        <w:t>:</w:t>
-      </w:r>
-      <w:r>
-        <w:rPr>
-          <w:spacing w:val="-8"/>
-        </w:rPr>
-        <w:t xml:space="preserve"> </w:t>
-      </w:r>
-      <w:r>
-        <w:t>(Tulis</w:t>
-      </w:r>
-      <w:r>
-        <w:rPr>
-          <w:spacing w:val="-5"/>
-        </w:rPr>
-        <w:t xml:space="preserve"> </w:t>
-      </w:r>
-      <w:r>
-        <w:t>NIDN</w:t>
-      </w:r>
-      <w:r>
-        <w:rPr>
-          <w:spacing w:val="-5"/>
-        </w:rPr>
-        <w:t xml:space="preserve"> </w:t>
-      </w:r>
-      <w:r>
-        <w:t>anggota</w:t>
-      </w:r>
-      <w:r>
-        <w:rPr>
-          <w:spacing w:val="-4"/>
-        </w:rPr>
-        <w:t xml:space="preserve"> </w:t>
-      </w:r>
-      <w:r>
-        <w:rPr>
-          <w:spacing w:val="-2"/>
-        </w:rPr>
-        <w:t>Peneliti</w:t>
-      </w:r>
-      <w:r>
-        <w:rPr>
-          <w:spacing w:val="-2"/>
-        </w:rPr>
-        <w:t>)</w:t>
+        <w:t>: ${NIDN_ANGGOTA}</w:t>
       </w:r>
     </w:p>
     <w:p>
@@ -2002,85 +1013,9 @@
         <w:ind w:left="285"/>
       </w:pPr>
       <w:r>
-        <w:t>Jabatan</w:t>
-      </w:r>
-      <w:r>
-        <w:rPr>
-          <w:spacing w:val="-2"/>
-        </w:rPr>
-        <w:t xml:space="preserve"> Fungsional</w:t>
-      </w:r>
-      <w:r>
+        <w:t>Jabatan Fungsional</w:t>
         <w:tab/>
-      </w:r>
-      <w:r>
-        <w:rPr>
-          <w:spacing w:val="-2"/>
-        </w:rPr>
-        <w:t>:</w:t>
-      </w:r>
-      <w:r>
-        <w:rPr>
-          <w:spacing w:val="-4"/>
-        </w:rPr>
-        <w:t xml:space="preserve"> </w:t>
-      </w:r>
-      <w:r>
-        <w:rPr>
-          <w:spacing w:val="-2"/>
-        </w:rPr>
-        <w:t>(Tulis</w:t>
-      </w:r>
-      <w:r>
-        <w:rPr>
-          <w:spacing w:val="-5"/>
-        </w:rPr>
-        <w:t xml:space="preserve"> </w:t>
-      </w:r>
-      <w:r>
-        <w:rPr>
-          <w:spacing w:val="-2"/>
-        </w:rPr>
-        <w:t>Jabatan</w:t>
-      </w:r>
-      <w:r>
-        <w:rPr>
-          <w:spacing w:val="-8"/>
-        </w:rPr>
-        <w:t xml:space="preserve"> </w:t>
-      </w:r>
-      <w:r>
-        <w:rPr>
-          <w:spacing w:val="-2"/>
-        </w:rPr>
-        <w:t>Fungsional</w:t>
-      </w:r>
-      <w:r>
-        <w:rPr>
-          <w:spacing w:val="-5"/>
-        </w:rPr>
-        <w:t xml:space="preserve"> </w:t>
-      </w:r>
-      <w:r>
-        <w:rPr>
-          <w:spacing w:val="-2"/>
-        </w:rPr>
-        <w:t>anggota</w:t>
-      </w:r>
-      <w:r>
-        <w:t xml:space="preserve"> </w:t>
-      </w:r>
-      <w:r>
-        <w:rPr>
-          <w:spacing w:val="-2"/>
-        </w:rPr>
-        <w:t>Peneliti</w:t>
-      </w:r>
-      <w:r>
-        <w:rPr>
-          <w:spacing w:val="-2"/>
-        </w:rPr>
-        <w:t>)</w:t>
+        <w:t>: ${JABATAN_ANGGOTA}</w:t>
       </w:r>
     </w:p>
     <w:p>
@@ -2093,77 +1028,9 @@
         <w:ind w:left="285"/>
       </w:pPr>
       <w:r>
-        <w:t>Program</w:t>
-      </w:r>
-      <w:r>
-        <w:rPr>
-          <w:spacing w:val="-3"/>
-        </w:rPr>
-        <w:t xml:space="preserve"> </w:t>
-      </w:r>
-      <w:r>
-        <w:rPr>
-          <w:spacing w:val="-2"/>
-        </w:rPr>
-        <w:t>Studi</w:t>
-      </w:r>
-      <w:r>
+        <w:t>Program Studi</w:t>
         <w:tab/>
-        <w:t>:</w:t>
-      </w:r>
-      <w:r>
-        <w:rPr>
-          <w:spacing w:val="-7"/>
-        </w:rPr>
-        <w:t xml:space="preserve"> </w:t>
-      </w:r>
-      <w:r>
-        <w:t>(Tulis</w:t>
-      </w:r>
-      <w:r>
-        <w:rPr>
-          <w:spacing w:val="-7"/>
-        </w:rPr>
-        <w:t xml:space="preserve"> </w:t>
-      </w:r>
-      <w:r>
-        <w:t>Program</w:t>
-      </w:r>
-      <w:r>
-        <w:rPr>
-          <w:spacing w:val="-3"/>
-        </w:rPr>
-        <w:t xml:space="preserve"> </w:t>
-      </w:r>
-      <w:r>
-        <w:t>Studi</w:t>
-      </w:r>
-      <w:r>
-        <w:rPr>
-          <w:spacing w:val="-2"/>
-        </w:rPr>
-        <w:t xml:space="preserve"> </w:t>
-      </w:r>
-      <w:r>
-        <w:t>anggota</w:t>
-      </w:r>
-      <w:r>
-        <w:rPr>
-          <w:spacing w:val="-2"/>
-        </w:rPr>
-        <w:t xml:space="preserve"> </w:t>
-      </w:r>
-      <w:r>
-        <w:rPr>
-          <w:spacing w:val="-2"/>
-        </w:rPr>
-        <w:t>Peneliti</w:t>
-      </w:r>
-      <w:r>
-        <w:rPr>
-          <w:spacing w:val="-2"/>
-        </w:rPr>
-        <w:t>)</w:t>
+        <w:t>: ${PRODI_ANGGOTA}</w:t>
       </w:r>
     </w:p>
     <w:p>
@@ -2215,74 +1082,9 @@
         <w:ind w:left="285"/>
       </w:pPr>
       <w:r>
-        <w:t>Nama</w:t>
-      </w:r>
-      <w:r>
-        <w:rPr>
-          <w:spacing w:val="-4"/>
-        </w:rPr>
-        <w:t xml:space="preserve"> </w:t>
-      </w:r>
-      <w:r>
-        <w:t xml:space="preserve">Institusi </w:t>
-      </w:r>
-      <w:r>
-        <w:rPr>
-          <w:spacing w:val="-2"/>
-        </w:rPr>
-        <w:t>Mitra</w:t>
-      </w:r>
-      <w:r>
+        <w:t>Nama Institusi Mitra</w:t>
         <w:tab/>
-        <w:t>:</w:t>
-      </w:r>
-      <w:r>
-        <w:rPr>
-          <w:spacing w:val="-4"/>
-        </w:rPr>
-        <w:t xml:space="preserve"> </w:t>
-      </w:r>
-      <w:r>
-        <w:t>(Tulis</w:t>
-      </w:r>
-      <w:r>
-        <w:rPr>
-          <w:spacing w:val="-4"/>
-        </w:rPr>
-        <w:t xml:space="preserve"> </w:t>
-      </w:r>
-      <w:r>
-        <w:t>nama</w:t>
-      </w:r>
-      <w:r>
-        <w:rPr>
-          <w:spacing w:val="-2"/>
-        </w:rPr>
-        <w:t xml:space="preserve"> </w:t>
-      </w:r>
-      <w:r>
-        <w:t>mitra</w:t>
-      </w:r>
-      <w:r>
-        <w:rPr>
-          <w:spacing w:val="-4"/>
-        </w:rPr>
-        <w:t xml:space="preserve"> </w:t>
-      </w:r>
-      <w:r>
-        <w:t>jika</w:t>
-      </w:r>
-      <w:r>
-        <w:rPr>
-          <w:spacing w:val="-3"/>
-        </w:rPr>
-        <w:t xml:space="preserve"> </w:t>
-      </w:r>
-      <w:r>
-        <w:rPr>
-          <w:spacing w:val="-4"/>
-        </w:rPr>
-        <w:t>ada)</w:t>
+        <w:t>: ${NAMA_MITRA}</w:t>
       </w:r>
     </w:p>
     <w:p>
@@ -2295,62 +1097,9 @@
         <w:ind w:left="285"/>
       </w:pPr>
       <w:r>
-        <w:rPr>
-          <w:spacing w:val="-2"/>
-        </w:rPr>
         <w:t>Alamat</w:t>
-      </w:r>
-      <w:r>
         <w:tab/>
-        <w:t>:</w:t>
-      </w:r>
-      <w:r>
-        <w:rPr>
-          <w:spacing w:val="-5"/>
-        </w:rPr>
-        <w:t xml:space="preserve"> </w:t>
-      </w:r>
-      <w:r>
-        <w:t>(Tulis</w:t>
-      </w:r>
-      <w:r>
-        <w:rPr>
-          <w:spacing w:val="-4"/>
-        </w:rPr>
-        <w:t xml:space="preserve"> </w:t>
-      </w:r>
-      <w:r>
-        <w:t>alamat</w:t>
-      </w:r>
-      <w:r>
-        <w:rPr>
-          <w:spacing w:val="-2"/>
-        </w:rPr>
-        <w:t xml:space="preserve"> </w:t>
-      </w:r>
-      <w:r>
-        <w:t>mitra</w:t>
-      </w:r>
-      <w:r>
-        <w:rPr>
-          <w:spacing w:val="-4"/>
-        </w:rPr>
-        <w:t xml:space="preserve"> </w:t>
-      </w:r>
-      <w:r>
-        <w:t>jika</w:t>
-      </w:r>
-      <w:r>
-        <w:rPr>
-          <w:spacing w:val="-6"/>
-        </w:rPr>
-        <w:t xml:space="preserve"> </w:t>
-      </w:r>
-      <w:r>
-        <w:rPr>
-          <w:spacing w:val="-4"/>
-        </w:rPr>
-        <w:t>ada)</w:t>
+        <w:t>: ${ALAMAT_MITRA}</w:t>
       </w:r>
     </w:p>
     <w:p>
@@ -2363,47 +1112,9 @@
         <w:ind w:left="285"/>
       </w:pPr>
       <w:r>
-        <w:t>Penanggung</w:t>
-      </w:r>
-      <w:r>
-        <w:rPr>
-          <w:spacing w:val="-4"/>
-        </w:rPr>
-        <w:t xml:space="preserve"> Jawab</w:t>
-      </w:r>
-      <w:r>
+        <w:t>Penanggung Jawab</w:t>
         <w:tab/>
-        <w:t>:</w:t>
-      </w:r>
-      <w:r>
-        <w:rPr>
-          <w:spacing w:val="-6"/>
-        </w:rPr>
-        <w:t xml:space="preserve"> </w:t>
-      </w:r>
-      <w:r>
-        <w:t>(Tulis</w:t>
-      </w:r>
-      <w:r>
-        <w:rPr>
-          <w:spacing w:val="-6"/>
-        </w:rPr>
-        <w:t xml:space="preserve"> </w:t>
-      </w:r>
-      <w:r>
-        <w:t>penanggung</w:t>
-      </w:r>
-      <w:r>
-        <w:rPr>
-          <w:spacing w:val="-3"/>
-        </w:rPr>
-        <w:t xml:space="preserve"> </w:t>
-      </w:r>
-      <w:r>
-        <w:rPr>
-          <w:spacing w:val="-2"/>
-        </w:rPr>
-        <w:t>jawab)</w:t>
+        <w:t>: ${PJ_MITRA}</w:t>
       </w:r>
     </w:p>
     <w:p>
@@ -2643,112 +1354,9 @@
         <w:ind w:left="285"/>
       </w:pPr>
       <w:r>
-        <w:rPr>
-          <w:u w:val="single"/>
-        </w:rPr>
-        <w:t>(Nama</w:t>
-      </w:r>
-      <w:r>
-        <w:rPr>
-          <w:spacing w:val="-4"/>
-          <w:u w:val="single"/>
-        </w:rPr>
-        <w:t xml:space="preserve"> </w:t>
-      </w:r>
-      <w:r>
-        <w:rPr>
-          <w:u w:val="single"/>
-        </w:rPr>
-        <w:t>Ketua</w:t>
-      </w:r>
-      <w:r>
-        <w:rPr>
-          <w:spacing w:val="-1"/>
-          <w:u w:val="single"/>
-        </w:rPr>
-        <w:t xml:space="preserve"> </w:t>
-      </w:r>
-      <w:r>
-        <w:rPr>
-          <w:u w:val="single"/>
-        </w:rPr>
-        <w:t>LPPM</w:t>
-      </w:r>
-      <w:r>
-        <w:rPr>
-          <w:spacing w:val="-1"/>
-          <w:u w:val="single"/>
-        </w:rPr>
-        <w:t xml:space="preserve"> </w:t>
-      </w:r>
-      <w:r>
-        <w:rPr>
-          <w:u w:val="single"/>
-        </w:rPr>
-        <w:t>beserta</w:t>
-      </w:r>
-      <w:r>
-        <w:rPr>
-          <w:spacing w:val="-4"/>
-          <w:u w:val="single"/>
-        </w:rPr>
-        <w:t xml:space="preserve"> </w:t>
-      </w:r>
-      <w:r>
-        <w:rPr>
-          <w:spacing w:val="-2"/>
-          <w:u w:val="single"/>
-        </w:rPr>
-        <w:t>gelar)</w:t>
-      </w:r>
-      <w:r>
+        <w:t>${KETUA_LPPM}</w:t>
         <w:tab/>
-      </w:r>
-      <w:r>
-        <w:rPr>
-          <w:u w:val="single"/>
-        </w:rPr>
-        <w:t>(Nama</w:t>
-      </w:r>
-      <w:r>
-        <w:rPr>
-          <w:spacing w:val="-5"/>
-          <w:u w:val="single"/>
-        </w:rPr>
-        <w:t xml:space="preserve"> </w:t>
-      </w:r>
-      <w:r>
-        <w:rPr>
-          <w:u w:val="single"/>
-        </w:rPr>
-        <w:t>Ketua</w:t>
-      </w:r>
-      <w:r>
-        <w:rPr>
-          <w:spacing w:val="-3"/>
-          <w:u w:val="single"/>
-        </w:rPr>
-        <w:t xml:space="preserve"> </w:t>
-      </w:r>
-      <w:r>
-        <w:rPr>
-          <w:u w:val="single"/>
-        </w:rPr>
-        <w:t>beserta</w:t>
-      </w:r>
-      <w:r>
-        <w:rPr>
-          <w:spacing w:val="-3"/>
-          <w:u w:val="single"/>
-        </w:rPr>
-        <w:t xml:space="preserve"> </w:t>
-      </w:r>
-      <w:r>
-        <w:rPr>
-          <w:spacing w:val="-2"/>
-          <w:u w:val="single"/>
-        </w:rPr>
-        <w:t>gelar)</w:t>
+        <w:t>${KETUA_LPPM}</w:t>
       </w:r>
     </w:p>
     <w:p>
@@ -2864,58 +1472,7 @@
         <w:ind w:left="3225" w:right="2594" w:firstLine="19"/>
       </w:pPr>
       <w:r>
-        <w:rPr>
-          <w:u w:val="single"/>
-        </w:rPr>
-        <w:t>(Nama</w:t>
-      </w:r>
-      <w:r>
-        <w:rPr>
-          <w:spacing w:val="-13"/>
-          <w:u w:val="single"/>
-        </w:rPr>
-        <w:t xml:space="preserve"> </w:t>
-      </w:r>
-      <w:r>
-        <w:rPr>
-          <w:u w:val="single"/>
-        </w:rPr>
-        <w:t>Rektor</w:t>
-      </w:r>
-      <w:r>
-        <w:rPr>
-          <w:spacing w:val="-14"/>
-          <w:u w:val="single"/>
-        </w:rPr>
-        <w:t xml:space="preserve"> </w:t>
-      </w:r>
-      <w:r>
-        <w:rPr>
-          <w:u w:val="single"/>
-        </w:rPr>
-        <w:t>beserta</w:t>
-      </w:r>
-      <w:r>
-        <w:rPr>
-          <w:spacing w:val="-13"/>
-          <w:u w:val="single"/>
-        </w:rPr>
-        <w:t xml:space="preserve"> </w:t>
-      </w:r>
-      <w:r>
-        <w:rPr>
-          <w:u w:val="single"/>
-        </w:rPr>
-        <w:t>gelar)</w:t>
-      </w:r>
-      <w:r>
-        <w:t xml:space="preserve"> </w:t>
-      </w:r>
-      <w:r>
-        <w:rPr>
-          <w:spacing w:val="-4"/>
-        </w:rPr>
-        <w:t>NIP.</w:t>
+        <w:t>${REKTOR} NIP.</w:t>
       </w:r>
     </w:p>
     <w:p>

</xml_diff>

<commit_message>
feat: auto-generate full document content including introduction, method, budget, schedule, and outputs for penelitian dosen
</commit_message>
<xml_diff>
--- a/storage/app/templates/Template_Laporan.docx
+++ b/storage/app/templates/Template_Laporan.docx
@@ -186,27 +186,7 @@
         </w:rPr>
       </w:pPr>
       <w:r>
-        <w:rPr>
-          <w:b/>
-          <w:sz w:val="28"/>
-        </w:rPr>
-        <w:t>Judul</w:t>
-      </w:r>
-      <w:r>
-        <w:rPr>
-          <w:b/>
-          <w:spacing w:val="-4"/>
-          <w:sz w:val="28"/>
-        </w:rPr>
-        <w:t xml:space="preserve"> </w:t>
-      </w:r>
-      <w:r>
-        <w:rPr>
-          <w:b/>
-          <w:spacing w:val="-2"/>
-          <w:sz w:val="28"/>
-        </w:rPr>
-        <w:t>Penelitian</w:t>
+        <w:t>${JUDUL}</w:t>
       </w:r>
     </w:p>
     <w:p>
@@ -304,58 +284,7 @@
         <w:jc w:val="center"/>
       </w:pPr>
       <w:r>
-        <w:t>Nama</w:t>
-      </w:r>
-      <w:r>
-        <w:rPr>
-          <w:spacing w:val="-6"/>
-        </w:rPr>
-        <w:t xml:space="preserve"> </w:t>
-      </w:r>
-      <w:r>
-        <w:t>Peneliti</w:t>
-      </w:r>
-      <w:r>
-        <w:t>,</w:t>
-      </w:r>
-      <w:r>
-        <w:rPr>
-          <w:spacing w:val="-3"/>
-        </w:rPr>
-        <w:t xml:space="preserve"> </w:t>
-      </w:r>
-      <w:r>
-        <w:t>lengkap</w:t>
-      </w:r>
-      <w:r>
-        <w:rPr>
-          <w:spacing w:val="-3"/>
-        </w:rPr>
-        <w:t xml:space="preserve"> </w:t>
-      </w:r>
-      <w:r>
-        <w:t>dengan</w:t>
-      </w:r>
-      <w:r>
-        <w:rPr>
-          <w:spacing w:val="-3"/>
-        </w:rPr>
-        <w:t xml:space="preserve"> </w:t>
-      </w:r>
-      <w:r>
-        <w:t>gelar</w:t>
-      </w:r>
-      <w:r>
-        <w:rPr>
-          <w:spacing w:val="-5"/>
-        </w:rPr>
-        <w:t xml:space="preserve"> </w:t>
-      </w:r>
-      <w:r>
-        <w:rPr>
-          <w:spacing w:val="-2"/>
-        </w:rPr>
-        <w:t>(NIDN)</w:t>
+        <w:t>${NAMA_KETUA}</w:t>
       </w:r>
     </w:p>
     <w:p>
@@ -429,22 +358,7 @@
         <w:jc w:val="center"/>
       </w:pPr>
       <w:r>
-        <w:rPr>
-          <w:spacing w:val="-2"/>
-        </w:rPr>
-        <w:t>Nama</w:t>
-      </w:r>
-      <w:r>
-        <w:rPr>
-          <w:spacing w:val="-9"/>
-        </w:rPr>
-        <w:t xml:space="preserve"> </w:t>
-      </w:r>
-      <w:r>
-        <w:rPr>
-          <w:spacing w:val="-2"/>
-        </w:rPr>
-        <w:t>Anggota</w:t>
+        <w:t>${NAMA_ANGGOTA}</w:t>
       </w:r>
     </w:p>
     <w:p>
@@ -1974,23 +1888,7 @@
         </w:rPr>
       </w:pPr>
       <w:r>
-        <w:rPr>
-          <w:lang w:val="en-US"/>
-        </w:rPr>
-        <w:t>DAFTAR PUSTAKA</w:t>
-      </w:r>
-      <w:r>
-        <w:rPr>
-          <w:lang w:val="en-US"/>
-        </w:rPr>
-        <w:tab/>
-      </w:r>
-      <w:r>
-        <w:rPr>
-          <w:lang w:val="en-US"/>
-        </w:rPr>
-        <w:tab/>
-        <w:t>22</w:t>
+        <w:t>${LUARAN}</w:t>
       </w:r>
     </w:p>
     <w:p>
@@ -2374,219 +2272,7 @@
         </w:rPr>
       </w:pPr>
       <w:r>
-        <w:rPr>
-          <w:sz w:val="24"/>
-        </w:rPr>
-        <w:t xml:space="preserve">Pendahuluan penelitian tidak lebih dari 1000 kata yang berisi </w:t>
-      </w:r>
-      <w:r>
-        <w:rPr>
-          <w:b/>
-          <w:sz w:val="24"/>
-        </w:rPr>
-        <w:t xml:space="preserve">latar belakang dan permasalahan yang akan </w:t>
-      </w:r>
-      <w:r>
-        <w:rPr>
-          <w:b/>
-          <w:sz w:val="24"/>
-        </w:rPr>
-        <w:t>diteliti, pendekatan pemecahan, state of the art dan kebaruan,</w:t>
-      </w:r>
-      <w:r>
-        <w:rPr>
-          <w:b/>
-          <w:spacing w:val="-15"/>
-          <w:sz w:val="24"/>
-        </w:rPr>
-        <w:t xml:space="preserve"> </w:t>
-      </w:r>
-      <w:r>
-        <w:rPr>
-          <w:b/>
-          <w:sz w:val="24"/>
-        </w:rPr>
-        <w:t>peta</w:t>
-      </w:r>
-      <w:r>
-        <w:rPr>
-          <w:b/>
-          <w:spacing w:val="-15"/>
-          <w:sz w:val="24"/>
-        </w:rPr>
-        <w:t xml:space="preserve"> </w:t>
-      </w:r>
-      <w:r>
-        <w:rPr>
-          <w:b/>
-          <w:sz w:val="24"/>
-        </w:rPr>
-        <w:t>jalan</w:t>
-      </w:r>
-      <w:r>
-        <w:rPr>
-          <w:b/>
-          <w:spacing w:val="-15"/>
-          <w:sz w:val="24"/>
-        </w:rPr>
-        <w:t xml:space="preserve"> </w:t>
-      </w:r>
-      <w:r>
-        <w:rPr>
-          <w:b/>
-          <w:sz w:val="24"/>
-        </w:rPr>
-        <w:t>(roadmap)</w:t>
-      </w:r>
-      <w:r>
-        <w:rPr>
-          <w:b/>
-          <w:spacing w:val="-15"/>
-          <w:sz w:val="24"/>
-        </w:rPr>
-        <w:t xml:space="preserve"> </w:t>
-      </w:r>
-      <w:r>
-        <w:rPr>
-          <w:b/>
-          <w:sz w:val="24"/>
-        </w:rPr>
-        <w:t>penelitian</w:t>
-      </w:r>
-      <w:r>
-        <w:rPr>
-          <w:b/>
-          <w:spacing w:val="-15"/>
-          <w:sz w:val="24"/>
-        </w:rPr>
-        <w:t xml:space="preserve"> </w:t>
-      </w:r>
-      <w:r>
-        <w:rPr>
-          <w:b/>
-          <w:sz w:val="24"/>
-        </w:rPr>
-        <w:t>5</w:t>
-      </w:r>
-      <w:r>
-        <w:rPr>
-          <w:b/>
-          <w:spacing w:val="-15"/>
-          <w:sz w:val="24"/>
-        </w:rPr>
-        <w:t xml:space="preserve"> </w:t>
-      </w:r>
-      <w:r>
-        <w:rPr>
-          <w:b/>
-          <w:sz w:val="24"/>
-        </w:rPr>
-        <w:t>tahun</w:t>
-      </w:r>
-      <w:r>
-        <w:rPr>
-          <w:b/>
-          <w:spacing w:val="-15"/>
-          <w:sz w:val="24"/>
-        </w:rPr>
-        <w:t xml:space="preserve"> </w:t>
-      </w:r>
-      <w:r>
-        <w:rPr>
-          <w:b/>
-          <w:sz w:val="24"/>
-        </w:rPr>
-        <w:t>kedepan</w:t>
-      </w:r>
-      <w:r>
-        <w:rPr>
-          <w:sz w:val="24"/>
-        </w:rPr>
-        <w:t>.</w:t>
-      </w:r>
-      <w:r>
-        <w:rPr>
-          <w:spacing w:val="-15"/>
-          <w:sz w:val="24"/>
-        </w:rPr>
-        <w:t xml:space="preserve"> </w:t>
-      </w:r>
-      <w:r>
-        <w:rPr>
-          <w:sz w:val="24"/>
-        </w:rPr>
-        <w:t>Sitasi</w:t>
-      </w:r>
-      <w:r>
-        <w:rPr>
-          <w:spacing w:val="-15"/>
-          <w:sz w:val="24"/>
-        </w:rPr>
-        <w:t xml:space="preserve"> </w:t>
-      </w:r>
-      <w:r>
-        <w:rPr>
-          <w:sz w:val="24"/>
-        </w:rPr>
-        <w:t>disusun</w:t>
-      </w:r>
-      <w:r>
-        <w:rPr>
-          <w:spacing w:val="-14"/>
-          <w:sz w:val="24"/>
-        </w:rPr>
-        <w:t xml:space="preserve"> </w:t>
-      </w:r>
-      <w:r>
-        <w:rPr>
-          <w:sz w:val="24"/>
-        </w:rPr>
-        <w:t>dan</w:t>
-      </w:r>
-      <w:r>
-        <w:rPr>
-          <w:spacing w:val="-15"/>
-          <w:sz w:val="24"/>
-        </w:rPr>
-        <w:t xml:space="preserve"> </w:t>
-      </w:r>
-      <w:r>
-        <w:rPr>
-          <w:sz w:val="24"/>
-        </w:rPr>
-        <w:t xml:space="preserve">ditulis dengan </w:t>
-      </w:r>
-      <w:r>
-        <w:rPr>
-          <w:b/>
-          <w:sz w:val="24"/>
-        </w:rPr>
-        <w:t>Vancouver style</w:t>
-      </w:r>
-      <w:r>
-        <w:rPr>
-          <w:sz w:val="24"/>
-        </w:rPr>
-        <w:t>. Sumber pustaka/referensi primer yang relevan dan dengan mengutamakan hasil penelitian pada ju</w:t>
-      </w:r>
-      <w:r>
-        <w:rPr>
-          <w:sz w:val="24"/>
-        </w:rPr>
-        <w:t xml:space="preserve">rnal ilmiah dan/atau paten yang terkini. Disarankan penggunaan </w:t>
-      </w:r>
-      <w:r>
-        <w:rPr>
-          <w:b/>
-          <w:sz w:val="24"/>
-        </w:rPr>
-        <w:t>sumber pustaka 10 tahun terakhir</w:t>
-      </w:r>
-      <w:r>
-        <w:rPr>
-          <w:sz w:val="24"/>
-        </w:rPr>
-        <w:t>.</w:t>
+        <w:t>${PENDAHULUAN}</w:t>
       </w:r>
     </w:p>
     <w:p>
@@ -3590,17 +3276,7 @@
         <w:jc w:val="both"/>
       </w:pPr>
       <w:r>
-        <w:t xml:space="preserve">Sitasi disusun dan ditulis berdasarkan sistem nomor sesuai dengan urutan pengutipan, mengikuti format </w:t>
-      </w:r>
-      <w:r>
-        <w:rPr>
-          <w:b/>
-          <w:i/>
-        </w:rPr>
-        <w:t>Vancouver style</w:t>
-      </w:r>
-      <w:r>
-        <w:t>. Hanya Pustaka yang disitasi pada usulan penelitian yang dicantumkan dalam Daftar Pustaka.</w:t>
+        <w:t>${PUSTAKA}</w:t>
       </w:r>
     </w:p>
     <w:p>
@@ -6229,61 +5905,39 @@
             <w:tcW w:w="562" w:type="dxa"/>
           </w:tcPr>
           <w:p>
-            <w:pPr>
-              <w:pStyle w:val="TableParagraph"/>
-              <w:spacing w:line="275" w:lineRule="exact"/>
-              <w:ind w:left="9"/>
-              <w:jc w:val="center"/>
-              <w:rPr>
-                <w:sz w:val="24"/>
-              </w:rPr>
-            </w:pPr>
-            <w:r>
-              <w:rPr>
-                <w:spacing w:val="-10"/>
-                <w:sz w:val="24"/>
-              </w:rPr>
+            <w:r>
+              <w:t>${B_NO}</w:t>
+            </w:r>
+          </w:p>
+        </w:tc>
+        <w:tc>
+          <w:tcPr>
+            <w:tcW w:w="2835" w:type="dxa"/>
+          </w:tcPr>
+          <w:p>
+            <w:r>
+              <w:t>${B_ITEM}</w:t>
+            </w:r>
+          </w:p>
+        </w:tc>
+        <w:tc>
+          <w:tcPr>
+            <w:tcW w:w="1700" w:type="dxa"/>
+          </w:tcPr>
+          <w:p>
+            <w:r>
               <w:t>1</w:t>
             </w:r>
           </w:p>
         </w:tc>
         <w:tc>
           <w:tcPr>
-            <w:tcW w:w="2835" w:type="dxa"/>
-          </w:tcPr>
-          <w:p>
-            <w:pPr>
-              <w:pStyle w:val="TableParagraph"/>
-              <w:rPr>
-                <w:sz w:val="24"/>
-              </w:rPr>
-            </w:pPr>
-          </w:p>
-        </w:tc>
-        <w:tc>
-          <w:tcPr>
             <w:tcW w:w="1700" w:type="dxa"/>
           </w:tcPr>
           <w:p>
-            <w:pPr>
-              <w:pStyle w:val="TableParagraph"/>
-              <w:rPr>
-                <w:sz w:val="24"/>
-              </w:rPr>
-            </w:pPr>
-          </w:p>
-        </w:tc>
-        <w:tc>
-          <w:tcPr>
-            <w:tcW w:w="1700" w:type="dxa"/>
-          </w:tcPr>
-          <w:p>
-            <w:pPr>
-              <w:pStyle w:val="TableParagraph"/>
-              <w:rPr>
-                <w:sz w:val="24"/>
-              </w:rPr>
-            </w:pPr>
+            <w:r>
+              <w:t>${B_HARGA}</w:t>
+            </w:r>
           </w:p>
         </w:tc>
         <w:tc>
@@ -6291,12 +5945,9 @@
             <w:tcW w:w="1699" w:type="dxa"/>
           </w:tcPr>
           <w:p>
-            <w:pPr>
-              <w:pStyle w:val="TableParagraph"/>
-              <w:rPr>
-                <w:sz w:val="24"/>
-              </w:rPr>
-            </w:pPr>
+            <w:r>
+              <w:t>${B_TOTAL}</w:t>
+            </w:r>
           </w:p>
         </w:tc>
       </w:tr>
@@ -7312,12 +6963,9 @@
             <w:tcW w:w="1699" w:type="dxa"/>
           </w:tcPr>
           <w:p>
-            <w:pPr>
-              <w:pStyle w:val="TableParagraph"/>
-              <w:rPr>
-                <w:sz w:val="24"/>
-              </w:rPr>
-            </w:pPr>
+            <w:r>
+              <w:t>${B_GRAND}</w:t>
+            </w:r>
           </w:p>
         </w:tc>
       </w:tr>

</xml_diff>